<commit_message>
Livro: apêndices E/F, bibliografia, licença; tipografia 10pt e citações 9pt
- PDF 10pt (build.sh); quote explícito 9pt no preamble; DOCX de referência alinhado
- Novos: apendice-e-terminal-ansi, apendice-f-records-extensions, bibliografia, licenca
- Ajustes em capítulos, glossário, epílogo, notas-do-autor; config/chapters.txt
- Steps: README/pubspec, jogador e testes; soluções cap03/cap28 sem emojis problemáticos
- Regenera PDF/EPUB/reference.docx e PNG FSM cap. 36

Made-with: Cursor
</commit_message>
<xml_diff>
--- a/output/reference.docx
+++ b/output/reference.docx
@@ -383,7 +383,7 @@
     <w:rPr>
       <w:rFonts w:ascii="Georgia" w:hAnsi="Georgia" w:eastAsia="Georgia"/>
       <w:smallCaps w:val="0"/>
-      <w:sz w:val="22"/>
+      <w:sz w:val="20"/>
     </w:rPr>
   </w:style>
   <w:style w:type="paragraph" w:styleId="Header">
@@ -504,7 +504,7 @@
       <w:bCs/>
       <w:smallCaps w:val="0"/>
       <w:color w:val="4F81BD" w:themeColor="accent1"/>
-      <w:sz w:val="22"/>
+      <w:sz w:val="20"/>
     </w:rPr>
   </w:style>
   <w:style w:type="paragraph" w:styleId="Heading4">
@@ -1078,7 +1078,7 @@
       <w:iCs/>
       <w:smallCaps w:val="0"/>
       <w:color w:val="000000" w:themeColor="text1"/>
-      <w:sz w:val="20"/>
+      <w:sz w:val="18"/>
     </w:rPr>
   </w:style>
   <w:style w:type="character" w:customStyle="1" w:styleId="QuoteChar">
@@ -12104,7 +12104,7 @@
       <w:rFonts w:ascii="Courier New" w:hAnsi="Courier New" w:eastAsia="Courier New"/>
       <w:smallCaps w:val="0"/>
       <w:color w:val="E8E8E8"/>
-      <w:sz w:val="18"/>
+      <w:sz w:val="16"/>
     </w:rPr>
   </w:style>
   <w:style w:type="character" w:customStyle="1" w:styleId="VerbatimChar">
@@ -12112,7 +12112,7 @@
     <w:rPr>
       <w:rFonts w:ascii="Courier New" w:hAnsi="Courier New" w:eastAsia="Courier New"/>
       <w:smallCaps w:val="0"/>
-      <w:sz w:val="19"/>
+      <w:sz w:val="16"/>
     </w:rPr>
   </w:style>
   <w:style w:type="character" w:customStyle="1" w:styleId="Code">
@@ -12120,7 +12120,7 @@
     <w:rPr>
       <w:rFonts w:ascii="Courier New" w:hAnsi="Courier New" w:eastAsia="Courier New"/>
       <w:smallCaps w:val="0"/>
-      <w:sz w:val="19"/>
+      <w:sz w:val="16"/>
     </w:rPr>
   </w:style>
 </w:styles>

</xml_diff>